<commit_message>
Point invoice recipients to Argo Books with tracked links
The person receiving an invoice is often a small business that invoices
too, so every invoice a user sends now carries a link to Argo Books with
its own source code, turning sent invoices into a growth loop whose
installs show on the referral links page.

- Portal: a short "Need to send invoices too?" line after paying and on an
  already paid invoice (loop-portal-paid), and the Powered by Argo Books
  footers now go to the downloads page (loop-portal).
- Invoice email: one small line at the bottom, added server side to the
  HTML and plain text the app sends (loop-invoice-email).
- Invoice generator: "Made with argorobots.com" is now a link in PDFs
  (loop-invgen-pdf), Word downloads and templates (loop-invgen-word) and
  Excel templates (loop-invgen-excel). Templates rebuilt.
- Referral links admin groups loop-* sources as "Invoice loop".

Co-Authored-By: Claude Opus 5 <noreply@anthropic.com>
</commit_message>
<xml_diff>
--- a/invoice-generator/templates/classic.docx
+++ b/invoice-generator/templates/classic.docx
@@ -833,14 +833,16 @@
     <w:pPr>
       <w:jc w:val="center"/>
     </w:pPr>
-    <w:r>
-      <w:rPr>
-        <w:color w:val="999999"/>
-        <w:sz w:val="18"/>
-        <w:szCs w:val="18"/>
-      </w:rPr>
-      <w:t xml:space="preserve">Made with argorobots.com</w:t>
-    </w:r>
+    <w:hyperlink w:history="1" r:id="rIdvekz0bzvkwpcgofr59wgn">
+      <w:r>
+        <w:rPr>
+          <w:color w:val="999999"/>
+          <w:sz w:val="18"/>
+          <w:szCs w:val="18"/>
+        </w:rPr>
+        <w:t xml:space="preserve">Made with argorobots.com</w:t>
+      </w:r>
+    </w:hyperlink>
   </w:p>
 </w:ftr>
 </file>

</xml_diff>